<commit_message>
Update Status Report for final submission
</commit_message>
<xml_diff>
--- a/02-Planning-and-Control/Status Report v1.5.docx
+++ b/02-Planning-and-Control/Status Report v1.5.docx
@@ -5377,6 +5377,8 @@
       <w:pPr>
         <w:rPr>
           <w:rFonts w:ascii="Times New Roman" w:hAnsi="Times New Roman" w:cs="Times New Roman"/>
+          <w:szCs w:val="22"/>
+          <w:highlight w:val="yellow"/>
         </w:rPr>
       </w:pPr>
     </w:p>
@@ -5384,52 +5386,18 @@
       <w:pPr>
         <w:rPr>
           <w:rFonts w:ascii="Times New Roman" w:hAnsi="Times New Roman" w:cs="Times New Roman"/>
-          <w:sz w:val="20"/>
           <w:szCs w:val="22"/>
           <w:highlight w:val="yellow"/>
         </w:rPr>
       </w:pPr>
-      <w:r>
-        <w:rPr>
-          <w:rFonts w:ascii="Times New Roman" w:hAnsi="Times New Roman" w:cs="Times New Roman"/>
-          <w:sz w:val="20"/>
-          <w:szCs w:val="22"/>
-          <w:highlight w:val="yellow"/>
-        </w:rPr>
-        <w:t>The evaluation of Ubuntu started two months ahead of schedule but was delayed due to the team’s misunderstandings of how the evaluations should be conducted to gather accurate results. However, the team was able to diagnose and resolve this problem as it was caught early in the process, thus hopefully preventing similar problems for the rest of the project. Therefore, the entirety of the project schedule has been slightly shortened, despite the Ubuntu evaluation taking longer overall.</w:t>
-      </w:r>
     </w:p>
     <w:p>
       <w:pPr>
         <w:rPr>
           <w:rFonts w:ascii="Times New Roman" w:hAnsi="Times New Roman" w:cs="Times New Roman"/>
+          <w:sz w:val="20"/>
+          <w:szCs w:val="22"/>
           <w:highlight w:val="yellow"/>
-        </w:rPr>
-      </w:pPr>
-    </w:p>
-    <w:p>
-      <w:pPr>
-        <w:rPr>
-          <w:rFonts w:ascii="Times New Roman" w:hAnsi="Times New Roman" w:cs="Times New Roman"/>
-          <w:sz w:val="20"/>
-          <w:szCs w:val="22"/>
-          <w:highlight w:val="yellow"/>
-        </w:rPr>
-      </w:pPr>
-      <w:r>
-        <w:rPr>
-          <w:rFonts w:ascii="Times New Roman" w:hAnsi="Times New Roman" w:cs="Times New Roman"/>
-          <w:sz w:val="20"/>
-          <w:szCs w:val="22"/>
-          <w:highlight w:val="yellow"/>
-        </w:rPr>
-        <w:t xml:space="preserve">Documentation of the processes during the Ubuntu evaluation was lacking due to workload imbalance between team members and subpar delegation. </w:t>
-      </w:r>
-    </w:p>
-    <w:p>
-      <w:pPr>
-        <w:rPr>
-          <w:rFonts w:ascii="Times New Roman" w:hAnsi="Times New Roman" w:cs="Times New Roman"/>
         </w:rPr>
         <w:sectPr>
           <w:pgSz w:w="16838" w:h="11906" w:orient="landscape"/>
@@ -5438,44 +5406,6 @@
           <w:docGrid w:linePitch="360"/>
         </w:sectPr>
       </w:pPr>
-      <w:r>
-        <w:rPr>
-          <w:rFonts w:ascii="Times New Roman" w:hAnsi="Times New Roman" w:cs="Times New Roman"/>
-          <w:sz w:val="20"/>
-          <w:szCs w:val="22"/>
-          <w:highlight w:val="yellow"/>
-        </w:rPr>
-        <w:t xml:space="preserve">This is a difficult, non-stop balancing act in team projects, but the team is actively working on improving these issues, as shown in the </w:t>
-      </w:r>
-      <w:r>
-        <w:rPr>
-          <w:rFonts w:ascii="Times New Roman" w:hAnsi="Times New Roman" w:cs="Times New Roman"/>
-          <w:i/>
-          <w:iCs/>
-          <w:sz w:val="20"/>
-          <w:szCs w:val="22"/>
-          <w:highlight w:val="yellow"/>
-        </w:rPr>
-        <w:t>Recommendation on Team Performance Improvement</w:t>
-      </w:r>
-      <w:r>
-        <w:rPr>
-          <w:rFonts w:ascii="Times New Roman" w:hAnsi="Times New Roman" w:cs="Times New Roman"/>
-          <w:sz w:val="20"/>
-          <w:szCs w:val="22"/>
-          <w:highlight w:val="yellow"/>
-        </w:rPr>
-        <w:t xml:space="preserve"> sectio</w:t>
-      </w:r>
-      <w:r>
-        <w:rPr>
-          <w:rFonts w:ascii="Times New Roman" w:hAnsi="Times New Roman" w:cs="Times New Roman"/>
-          <w:sz w:val="20"/>
-          <w:szCs w:val="22"/>
-          <w:highlight w:val="yellow"/>
-        </w:rPr>
-        <w:t>n.</w:t>
-      </w:r>
     </w:p>
     <w:p>
       <w:pPr>
@@ -6754,6 +6684,50 @@
               <w:t>Work Breakdown Structure</w:t>
             </w:r>
           </w:p>
+          <w:p>
+            <w:pPr>
+              <w:pStyle w:val="ListParagraph"/>
+              <w:numPr>
+                <w:ilvl w:val="0"/>
+                <w:numId w:val="28"/>
+              </w:numPr>
+              <w:rPr>
+                <w:rFonts w:ascii="Times New Roman" w:hAnsi="Times New Roman" w:cs="Times New Roman"/>
+                <w:sz w:val="18"/>
+                <w:szCs w:val="18"/>
+              </w:rPr>
+            </w:pPr>
+            <w:r>
+              <w:rPr>
+                <w:rFonts w:ascii="Times New Roman" w:hAnsi="Times New Roman" w:cs="Times New Roman"/>
+                <w:sz w:val="18"/>
+                <w:szCs w:val="18"/>
+              </w:rPr>
+              <w:t>Project Display Website</w:t>
+            </w:r>
+          </w:p>
+          <w:p>
+            <w:pPr>
+              <w:pStyle w:val="ListParagraph"/>
+              <w:numPr>
+                <w:ilvl w:val="0"/>
+                <w:numId w:val="28"/>
+              </w:numPr>
+              <w:rPr>
+                <w:rFonts w:ascii="Times New Roman" w:hAnsi="Times New Roman" w:cs="Times New Roman"/>
+                <w:sz w:val="18"/>
+                <w:szCs w:val="18"/>
+              </w:rPr>
+            </w:pPr>
+            <w:r>
+              <w:rPr>
+                <w:rFonts w:ascii="Times New Roman" w:hAnsi="Times New Roman" w:cs="Times New Roman"/>
+                <w:sz w:val="18"/>
+                <w:szCs w:val="18"/>
+              </w:rPr>
+              <w:t>Status Report V1.5</w:t>
+            </w:r>
+          </w:p>
         </w:tc>
         <w:tc>
           <w:tcPr>
@@ -8461,7 +8435,25 @@
           <w:szCs w:val="20"/>
           <w:highlight w:val="yellow"/>
         </w:rPr>
-        <w:t>, our team planned to have regular weekly meetings with the client and mentor. We transitioned to fortnightly meetings from the second phase onwards. In total, we conducted 6 meetings with the client and mentor with a total duration of 6 hours. This is only slightly less than expected</w:t>
+        <w:t xml:space="preserve">, our team planned to have regular weekly meetings with the client and mentor. We transitioned to fortnightly meetings from the second phase onwards. In total, we conducted </w:t>
+      </w:r>
+      <w:r>
+        <w:rPr>
+          <w:rFonts w:ascii="Times New Roman" w:hAnsi="Times New Roman" w:cs="Times New Roman"/>
+          <w:sz w:val="20"/>
+          <w:szCs w:val="20"/>
+          <w:highlight w:val="yellow"/>
+        </w:rPr>
+        <w:t>13</w:t>
+      </w:r>
+      <w:r>
+        <w:rPr>
+          <w:rFonts w:ascii="Times New Roman" w:hAnsi="Times New Roman" w:cs="Times New Roman"/>
+          <w:sz w:val="20"/>
+          <w:szCs w:val="20"/>
+          <w:highlight w:val="yellow"/>
+        </w:rPr>
+        <w:t xml:space="preserve"> meetings with the client and mentor with a total duration of 6 hours. This is only slightly less than expected</w:t>
       </w:r>
       <w:r>
         <w:rPr>

</xml_diff>